<commit_message>
i18n: Update continuous translations [centroid-bot]
</commit_message>
<xml_diff>
--- a/newfile/samplereportdocxx.fr.docx
+++ b/newfile/samplereportdocxx.fr.docx
@@ -32,7 +32,7 @@
           <w:szCs w:val="20"/>
           <w:lang w:val="fr-FR"/>
         </w:rPr>
-        <w:t xml:space="preserve">T3 2026  |  Préparé par : Équipe des Ventes</w:t>
+        <w:t>T3 2026 | Préparé par : Équipe des Ventes</w:t>
       </w:r>
     </w:p>
     <w:p>
@@ -60,92 +60,13 @@
       <w:r>
         <w:rPr>
           <w:rFonts w:ascii="Arial" w:hAnsi="Arial"/>
-          <w:sz w:val="21"/>
-          <w:szCs w:val="21"/>
-          <w:lang w:val="fr-FR"/>
-        </w:rPr>
-        <w:t xml:space="preserve">Ce trimestre, l'entreprise a réalisé </w:t>
-      </w:r>
-      <w:r>
-        <w:rPr>
-          <w:rFonts w:ascii="Arial" w:hAnsi="Arial"/>
           <w:b/>
           <w:bCs/>
           <w:sz w:val="21"/>
           <w:szCs w:val="21"/>
           <w:lang w:val="fr-FR"/>
         </w:rPr>
-        <w:t>un chiffre d'affaires total de 48,6 lakh Rs.</w:t>
-      </w:r>
-      <w:r>
-        <w:rPr>
-          <w:rFonts w:ascii="Arial" w:hAnsi="Arial"/>
-          <w:sz w:val="21"/>
-          <w:szCs w:val="21"/>
-          <w:lang w:val="fr-FR"/>
-        </w:rPr>
-        <w:t xml:space="preserve">, soit </w:t>
-      </w:r>
-      <w:r>
-        <w:rPr>
-          <w:rFonts w:ascii="Arial" w:hAnsi="Arial"/>
-          <w:b/>
-          <w:bCs/>
-          <w:color w:val="2E7D32"/>
-          <w:sz w:val="21"/>
-          <w:szCs w:val="21"/>
-          <w:lang w:val="fr-FR"/>
-        </w:rPr>
-        <w:t>12% de plus</w:t>
-      </w:r>
-      <w:r>
-        <w:rPr>
-          <w:rFonts w:ascii="Arial" w:hAnsi="Arial"/>
-          <w:sz w:val="21"/>
-          <w:szCs w:val="21"/>
-          <w:lang w:val="fr-FR"/>
-        </w:rPr>
-        <w:t xml:space="preserve"> que le trimestre précédent. La région </w:t>
-      </w:r>
-      <w:r>
-        <w:rPr>
-          <w:rFonts w:ascii="Arial" w:hAnsi="Arial"/>
-          <w:i/>
-          <w:iCs/>
-          <w:sz w:val="21"/>
-          <w:szCs w:val="21"/>
-          <w:lang w:val="fr-FR"/>
-        </w:rPr>
-        <w:t>Nord</w:t>
-      </w:r>
-      <w:r>
-        <w:rPr>
-          <w:rFonts w:ascii="Arial" w:hAnsi="Arial"/>
-          <w:sz w:val="21"/>
-          <w:szCs w:val="21"/>
-          <w:lang w:val="fr-FR"/>
-        </w:rPr>
-        <w:t xml:space="preserve"> a obtenu les meilleurs résultats, tandis que la région </w:t>
-      </w:r>
-      <w:r>
-        <w:rPr>
-          <w:rFonts w:ascii="Arial" w:hAnsi="Arial"/>
-          <w:i/>
-          <w:iCs/>
-          <w:sz w:val="21"/>
-          <w:szCs w:val="21"/>
-          <w:lang w:val="fr-FR"/>
-        </w:rPr>
-        <w:t>Est</w:t>
-      </w:r>
-      <w:r>
-        <w:rPr>
-          <w:rFonts w:ascii="Arial" w:hAnsi="Arial"/>
-          <w:sz w:val="21"/>
-          <w:szCs w:val="21"/>
-          <w:lang w:val="fr-FR"/>
-        </w:rPr>
-        <w:t xml:space="preserve"> nécessite plus d'attention.</w:t>
+        <w:t>Ce trimestre, l'entreprise a réalisé un chiffre d'affaires total de 48,6 lakh Rs. , soit 12% de plus que le trimestre précédent. La région Nord a obtenu les meilleurs résultats, tandis que la région Est nécessite plus d'attention.</w:t>
       </w:r>
     </w:p>
     <w:p>
@@ -201,7 +122,7 @@
           <w:szCs w:val="21"/>
           <w:lang w:val="fr-FR"/>
         </w:rPr>
-        <w:t>.</w:t>
+        <w:t xml:space="preserve"> .</w:t>
       </w:r>
     </w:p>
     <w:p>
@@ -1155,50 +1076,13 @@
       <w:r>
         <w:rPr>
           <w:rFonts w:ascii="Arial" w:hAnsi="Arial"/>
-          <w:sz w:val="21"/>
-          <w:szCs w:val="21"/>
-          <w:lang w:val="fr-FR"/>
-        </w:rPr>
-        <w:t xml:space="preserve">Le trimestre prochain, l'accent sera mis sur l'amélioration des ventes dans la région </w:t>
-      </w:r>
-      <w:r>
-        <w:rPr>
-          <w:rFonts w:ascii="Arial" w:hAnsi="Arial"/>
           <w:b/>
           <w:bCs/>
           <w:sz w:val="21"/>
           <w:szCs w:val="21"/>
           <w:lang w:val="fr-FR"/>
         </w:rPr>
-        <w:t>Est</w:t>
-      </w:r>
-      <w:r>
-        <w:rPr>
-          <w:rFonts w:ascii="Arial" w:hAnsi="Arial"/>
-          <w:sz w:val="21"/>
-          <w:szCs w:val="21"/>
-          <w:lang w:val="fr-FR"/>
-        </w:rPr>
-        <w:t xml:space="preserve"> grâce au marketing local et à un meilleur soutien des distributeurs. L'objectif global pour le T4 est </w:t>
-      </w:r>
-      <w:r>
-        <w:rPr>
-          <w:rFonts w:ascii="Arial" w:hAnsi="Arial"/>
-          <w:sz w:val="21"/>
-          <w:szCs w:val="21"/>
-          <w:u w:val="single"/>
-          <w:lang w:val="fr-FR"/>
-        </w:rPr>
-        <w:t>52 lakh Rs.</w:t>
-      </w:r>
-      <w:r>
-        <w:rPr>
-          <w:rFonts w:ascii="Arial" w:hAnsi="Arial"/>
-          <w:sz w:val="21"/>
-          <w:szCs w:val="21"/>
-          <w:lang w:val="fr-FR"/>
-        </w:rPr>
-        <w:t>.</w:t>
+        <w:t>Le trimestre prochain, l'accent sera mis sur l'amélioration des ventes dans la région Est grâce au marketing local et à un meilleur soutien des distributeurs. L'objectif global pour le T4 est 52 lakh Rs. .</w:t>
       </w:r>
     </w:p>
     <w:sectPr>

</xml_diff>